<commit_message>
Focus FHLIP abstract on adoption findings
</commit_message>
<xml_diff>
--- a/output/abstracts/Kavanagh_Douglas_FHLIPConference_2027.docx
+++ b/output/abstracts/Kavanagh_Douglas_FHLIPConference_2027.docx
@@ -49,7 +49,7 @@
         <w:t xml:space="preserve">Abstract. </w:t>
       </w:r>
       <w:r>
-        <w:t>Health systems often evaluate clinical artificial intelligence by accuracy and latency, although sustained adoption also depends on whether operational value exceeds implementation burden. We report a single-site implementation of an artificial intelligence-assisted eReferral triage tool in an outpatient cardiology clinic. After a four-month refinement period, system logs and clinic feedback were reviewed for a six-week demonstration. The clinic received 87 referrals; 33 (38%) triggered an alert, including five referrals marked routine by the sender that met the clinic's urgent-review criteria. Mean automated time to action was 24.34 seconds, and no manual overrides were recorded. The clinic nevertheless reported limited overall workflow impact and later discontinued use because low referral volume did not justify setup, oversight, and ongoing technical maintenance. The chest-pain rule also produced clinically mixed matches, despite aggregate performance metrics showing no recorded outliers. This case suggests that technical performance is necessary but insufficient for adoption. Health systems should assess minimum viable referral volume, workflow readiness, maintenance ownership, human oversight, and total implementation effort before launch. High-volume central intake programs are likely better settings for evaluating whether AI-assisted triage produces sustainable operational benefit.</w:t>
+        <w:t>Health systems often evaluate clinical artificial intelligence by accuracy and latency, although sustained adoption also depends on whether operational value exceeds implementation burden. We report a single-site implementation of an artificial intelligence-assisted eReferral triage tool in an outpatient cardiology clinic. After a four-month refinement period, system logs and clinic feedback were reviewed for a six-week demonstration. The clinic received 87 referrals; 33 (38%) triggered an alert, including five referrals marked routine by the sender that met the clinic's urgent-review criteria. Mean automated time to action was 24.34 seconds, and no manual overrides were recorded. The clinic nevertheless reported limited overall workflow impact and later discontinued use because low referral volume did not justify setup, oversight, and ongoing technical maintenance. This case suggests that technical performance is necessary but insufficient for adoption. Health systems should assess minimum viable referral volume, workflow readiness, maintenance ownership, human oversight, and total implementation effort before launch. High-volume central intake programs are likely better settings for evaluating whether AI-assisted triage produces sustainable operational benefit.</w:t>
       </w:r>
     </w:p>
     <w:p>
@@ -109,7 +109,7 @@
     <w:p>
       <w:pPr/>
       <w:r>
-        <w:t>The Autorouter was a separate application that subscribed to eReferral events, analyzed structured and narrative referral content using a site-selected large language model, evaluated plain-language rules, and called bounded workflow tools. The implementation focused on two alerting rules rather than comprehensive autonomous routing. One rule identified referrals that might require urgent review based on criteria such as new exertional chest pain, acute coronary syndrome, exertional syncope, or critical valvular disease. The second identified referrals that might be suitable for the clinic's Chest Pain Clinic.</w:t>
+        <w:t>The Autorouter was a separate application that subscribed to eReferral events, analyzed structured and narrative referral content using a site-selected large language model, evaluated plain-language rules, and called bounded workflow tools. The implementation focused on two alerting rules rather than comprehensive autonomous routing. One rule identified referrals that might require urgent review based on criteria such as new exertional chest pain, acute coronary syndrome, exertional syncope, or critical valvular disease. The second identified referrals that might be suitable for a service-specific intake pathway.</w:t>
       </w:r>
     </w:p>
     <w:p>
@@ -173,7 +173,7 @@
     <w:p>
       <w:pPr/>
       <w:r>
-        <w:t>Clinic feedback qualified the aggregate metrics. Staff described the urgent-referral rule as highly accurate when physician notes explicitly contained words such as urgent or priority. They described mixed results for the Chest Pain Clinic rule because general symptom descriptions could mention chest pain without meeting the program's intended criteria. The clinic's overall assessment was that the system had limited impact on its referral workflow at that stage.</w:t>
+        <w:t>The clinic's overall assessment was that the system had limited impact on its referral workflow at that stage.</w:t>
       </w:r>
     </w:p>
     <w:p>
@@ -266,7 +266,7 @@
         <w:pStyle w:val="NoindentNormal"/>
       </w:pPr>
       <w:r>
-        <w:t>This report describes one clinic, one narrow configuration, 87 referrals, and six weeks of prospective observation. The baseline was non-concurrent, review time was estimated, and no labor savings, patient outcomes, response after alerting, or total cost were measured. No independent adjudication or systematic review of all non-triggered referrals was documented, and clinic feedback identified mixed Chest Pain Clinic matches. Proposed reasons for limited wider deployment were not evaluated through structured interviews or site comparisons. The relationship between higher volume and sustainability remains a hypothesis.</w:t>
+        <w:t>This report describes one clinic, one narrow configuration, 87 referrals, and six weeks of prospective observation. The baseline was non-concurrent, review time was estimated, and no labor savings, patient outcomes, response after alerting, or total cost were measured. No independent adjudication or systematic review of all non-triggered referrals was documented. Proposed reasons for limited wider deployment were not evaluated through structured interviews or site comparisons. The relationship between higher volume and sustainability remains a hypothesis.</w:t>
       </w:r>
     </w:p>
     <w:p>

</xml_diff>

<commit_message>
Anonymize clinic in FHLIP abstract
</commit_message>
<xml_diff>
--- a/output/abstracts/Kavanagh_Douglas_FHLIPConference_2027.docx
+++ b/output/abstracts/Kavanagh_Douglas_FHLIPConference_2027.docx
@@ -103,7 +103,7 @@
         <w:pStyle w:val="NoindentNormal"/>
       </w:pPr>
       <w:r>
-        <w:t>The demonstration took place at Cardiac Care North York, an outpatient cardiology clinic using the Ocean electronic referral platform. Eleven clinic users participated in referral intake workflows. Thirty-six unique senders submitted referrals during the demonstration period. The participating site was the only receiving clinic connected to the automated routing interface in the final project scope.</w:t>
+        <w:t>The demonstration took place at an outpatient cardiology clinic in Toronto, Ontario, using the Ocean electronic referral platform. Eleven clinic users participated in referral intake workflows. Thirty-six unique senders submitted referrals during the demonstration period. The participating site was the only receiving clinic connected to the automated routing interface in the final project scope.</w:t>
       </w:r>
     </w:p>
     <w:p>
@@ -300,7 +300,7 @@
         <w:pStyle w:val="NoindentNormal"/>
       </w:pPr>
       <w:r>
-        <w:t>This implementation was completed through Canada Health Infoway's Vendor Innovation Program with participation from Cardiac Care North York and project support from OceanMD staff.</w:t>
+        <w:t>This implementation was completed through Canada Health Infoway's Vendor Innovation Program with participation from the clinic and support from the OceanMD project team.</w:t>
       </w:r>
     </w:p>
     <w:p>

</xml_diff>